<commit_message>
Urine letter: signer rank goes inside the parentheses with the name — ( ร.ต.อ.ชื่อ สกุล ) — blank line above stays blank as in the real form
Co-Authored-By: Claude Opus 5 <noreply@anthropic.com>
</commit_message>
<xml_diff>
--- a/build/urine_referral_template.docx
+++ b/build/urine_referral_template.docx
@@ -726,12 +726,6 @@
           <w:rFonts w:ascii="TH SarabunPSK" w:hAnsi="TH SarabunPSK" w:cs="TH SarabunPSK"/>
         </w:rPr>
       </w:pPr>
-      <w:r>
-        <w:rPr>
-          <w:rFonts w:ascii="TH SarabunIT๙" w:hAnsi="TH SarabunIT๙"/>
-        </w:rPr>
-        <w:t>{signer_rank}</w:t>
-      </w:r>
     </w:p>
     <w:p>
       <w:pPr>
@@ -760,7 +754,7 @@
           <w:cs/>
           <w:lang w:eastAsia="zh-CN"/>
         </w:rPr>
-        <w:t xml:space="preserve">{signer_name} </w:t>
+        <w:t xml:space="preserve">{signer_rank}{signer_name} </w:t>
       </w:r>
       <w:proofErr w:type="gramEnd"/>
       <w:r>

</xml_diff>

<commit_message>
Urine letter signature: rank on its own line, left-aligned to the start of "( name )", leaving room to sign
- Reverts the "( ร.ต.อ.ชื่อ )" attempt; name line stays centered exactly as in the real form
- Rank paragraph is now left-aligned with w:left="{signer_rank_indent}", computed at export from the estimated width of the centered name line (TH Sarabun 15pt, 9026-twip text area, 1418 first-line indent) minus 0.6 cm, so the rank sits just before the opening parenthesis for any rank/name length
- Verified by rendering through Word (COM → PDF) with a short and a long signer

Co-Authored-By: Claude Opus 5 <noreply@anthropic.com>
</commit_message>
<xml_diff>
--- a/build/urine_referral_template.docx
+++ b/build/urine_referral_template.docx
@@ -720,21 +720,27 @@
     </w:p>
     <w:p>
       <w:pPr>
+        <w:ind w:left="{signer_rank_indent}"/>
+        <w:jc w:val="left"/>
+        <w:rPr>
+          <w:rFonts w:ascii="TH SarabunPSK" w:hAnsi="TH SarabunPSK" w:cs="TH SarabunPSK"/>
+        </w:rPr>
+      </w:pPr>
+      <w:r>
+        <w:rPr>
+          <w:rFonts w:ascii="TH SarabunIT๙" w:hAnsi="TH SarabunIT๙"/>
+        </w:rPr>
+        <w:t>{signer_rank}</w:t>
+      </w:r>
+    </w:p>
+    <w:p>
+      <w:pPr>
         <w:ind w:firstLine="1418"/>
         <w:jc w:val="center"/>
         <w:rPr>
           <w:rFonts w:ascii="TH SarabunPSK" w:hAnsi="TH SarabunPSK" w:cs="TH SarabunPSK"/>
         </w:rPr>
       </w:pPr>
-    </w:p>
-    <w:p>
-      <w:pPr>
-        <w:ind w:firstLine="1418"/>
-        <w:jc w:val="center"/>
-        <w:rPr>
-          <w:rFonts w:ascii="TH SarabunPSK" w:hAnsi="TH SarabunPSK" w:cs="TH SarabunPSK"/>
-        </w:rPr>
-      </w:pPr>
       <w:proofErr w:type="gramStart"/>
       <w:r>
         <w:rPr>
@@ -754,7 +760,7 @@
           <w:cs/>
           <w:lang w:eastAsia="zh-CN"/>
         </w:rPr>
-        <w:t xml:space="preserve">{signer_rank}{signer_name} </w:t>
+        <w:t xml:space="preserve">{signer_name} </w:t>
       </w:r>
       <w:proofErr w:type="gramEnd"/>
       <w:r>

</xml_diff>